<commit_message>
Started fresh with the logic to display Users and starting with calculation Functions, This included re-doing and clarifying functions based on requirements, Also restructured the evidence with adding code snippets and output of the test results from the console.logs()
</commit_message>
<xml_diff>
--- a/PM-02/learner-performance-tracker/evidence/testing.docx
+++ b/PM-02/learner-performance-tracker/evidence/testing.docx
@@ -1,22 +1,44 @@
 
 <file path=word/document.xml><?xml version="1.0" encoding="utf-8"?>
-<w:document xmlns:wpc="http://schemas.microsoft.com/office/word/2010/wordprocessingCanvas" xmlns:cx="http://schemas.microsoft.com/office/drawing/2014/chartex" xmlns:cx1="http://schemas.microsoft.com/office/drawing/2015/9/8/chartex" xmlns:cx2="http://schemas.microsoft.com/office/drawing/2015/10/21/chartex" xmlns:cx3="http://schemas.microsoft.com/office/drawing/2016/5/9/chartex" xmlns:cx4="http://schemas.microsoft.com/office/drawing/2016/5/10/chartex" xmlns:cx5="http://schemas.microsoft.com/office/drawing/2016/5/11/chartex" xmlns:cx6="http://schemas.microsoft.com/office/drawing/2016/5/12/chartex" xmlns:cx7="http://schemas.microsoft.com/office/drawing/2016/5/13/chartex" xmlns:cx8="http://schemas.microsoft.com/office/drawing/2016/5/14/chartex" xmlns:mc="http://schemas.openxmlformats.org/markup-compatibility/2006" xmlns:aink="http://schemas.microsoft.com/office/drawing/2016/ink" xmlns:am3d="http://schemas.microsoft.com/office/drawing/2017/model3d" xmlns:o="urn:schemas-microsoft-com:office:office" xmlns:oel="http://schemas.microsoft.com/office/2019/extlst" xmlns:r="http://schemas.openxmlformats.org/officeDocument/2006/relationships" xmlns:m="http://schemas.openxmlformats.org/officeDocument/2006/math" xmlns:v="urn:schemas-microsoft-com:vml" xmlns:wp14="http://schemas.microsoft.com/office/word/2010/wordprocessingDrawing" xmlns:wp="http://schemas.openxmlformats.org/drawingml/2006/wordprocessingDrawing" xmlns:w10="urn:schemas-microsoft-com:office:word" xmlns:w="http://schemas.openxmlformats.org/wordprocessingml/2006/main" xmlns:w14="http://schemas.microsoft.com/office/word/2010/wordml" xmlns:w15="http://schemas.microsoft.com/office/word/2012/wordml" xmlns:w16cex="http://schemas.microsoft.com/office/word/2018/wordml/cex" xmlns:w16cid="http://schemas.microsoft.com/office/word/2016/wordml/cid" xmlns:w16="http://schemas.microsoft.com/office/word/2018/wordml" xmlns:w16du="http://schemas.microsoft.com/office/word/2023/wordml/word16du" xmlns:w16sdtdh="http://schemas.microsoft.com/office/word/2020/wordml/sdtdatahash" xmlns:w16sdtfl="http://schemas.microsoft.com/office/word/2024/wordml/sdtformatlock" xmlns:w16se="http://schemas.microsoft.com/office/word/2015/wordml/symex" xmlns:wpg="http://schemas.microsoft.com/office/word/2010/wordprocessingGroup" xmlns:wpi="http://schemas.microsoft.com/office/word/2010/wordprocessingInk" xmlns:wne="http://schemas.microsoft.com/office/word/2006/wordml" xmlns:wps="http://schemas.microsoft.com/office/word/2010/wordprocessingShape" mc:Ignorable="w14 w15 w16se w16cid w16 w16cex w16sdtdh w16sdtfl w16du wp14">
+<w:document xmlns:wpc="http://schemas.microsoft.com/office/word/2010/wordprocessingCanvas" xmlns:cx="http://schemas.microsoft.com/office/drawing/2014/chartex" xmlns:cx1="http://schemas.microsoft.com/office/drawing/2015/9/8/chartex" xmlns:mc="http://schemas.openxmlformats.org/markup-compatibility/2006" xmlns:o="urn:schemas-microsoft-com:office:office" xmlns:r="http://schemas.openxmlformats.org/officeDocument/2006/relationships" xmlns:m="http://schemas.openxmlformats.org/officeDocument/2006/math" xmlns:v="urn:schemas-microsoft-com:vml" xmlns:wp14="http://schemas.microsoft.com/office/word/2010/wordprocessingDrawing" xmlns:wp="http://schemas.openxmlformats.org/drawingml/2006/wordprocessingDrawing" xmlns:w10="urn:schemas-microsoft-com:office:word" xmlns:w="http://schemas.openxmlformats.org/wordprocessingml/2006/main" xmlns:w14="http://schemas.microsoft.com/office/word/2010/wordml" xmlns:w15="http://schemas.microsoft.com/office/word/2012/wordml" xmlns:w16se="http://schemas.microsoft.com/office/word/2015/wordml/symex" xmlns:wpg="http://schemas.microsoft.com/office/word/2010/wordprocessingGroup" xmlns:wpi="http://schemas.microsoft.com/office/word/2010/wordprocessingInk" xmlns:wne="http://schemas.microsoft.com/office/word/2006/wordml" xmlns:wps="http://schemas.microsoft.com/office/word/2010/wordprocessingShape" mc:Ignorable="w14 w15 w16se wp14">
   <w:body>
     <w:p>
-      <w:r>
-        <w:t>Index html:</w:t>
-      </w:r>
-    </w:p>
-    <w:p>
-      <w:r>
-        <w:rPr>
-          <w:noProof/>
-        </w:rPr>
+      <w:pPr>
+        <w:pStyle w:val="Heading1"/>
+      </w:pPr>
+      <w:r>
+        <w:t>HTML Code Snippets:</w:t>
+      </w:r>
+    </w:p>
+    <w:p>
+      <w:pPr>
+        <w:pStyle w:val="Heading1"/>
+      </w:pPr>
+      <w:r>
+        <w:t>JavaScript Code Snippets:</w:t>
+      </w:r>
+    </w:p>
+    <w:p>
+      <w:pPr>
+        <w:pStyle w:val="Heading2"/>
+      </w:pPr>
+      <w:r>
+        <w:t>Array</w:t>
+      </w:r>
+      <w:r>
+        <w:t xml:space="preserve"> – Hold Student Information</w:t>
+      </w:r>
+      <w:r>
+        <w:t>:</w:t>
+      </w:r>
+    </w:p>
+    <w:p>
+      <w:r>
         <w:drawing>
-          <wp:inline distT="0" distB="0" distL="0" distR="0" wp14:anchorId="068FC87F" wp14:editId="08E74EEE">
-            <wp:extent cx="5731510" cy="2618740"/>
-            <wp:effectExtent l="0" t="0" r="2540" b="0"/>
-            <wp:docPr id="2026513207" name="Picture 1"/>
+          <wp:inline distT="0" distB="0" distL="0" distR="0" wp14:anchorId="22A51B58" wp14:editId="02B2D4F2">
+            <wp:extent cx="3214328" cy="6227008"/>
+            <wp:effectExtent l="0" t="0" r="5715" b="2540"/>
+            <wp:docPr id="1" name="Picture 1"/>
             <wp:cNvGraphicFramePr>
               <a:graphicFrameLocks xmlns:a="http://schemas.openxmlformats.org/drawingml/2006/main" noChangeAspect="1"/>
             </wp:cNvGraphicFramePr>
@@ -24,7 +46,7 @@
               <a:graphicData uri="http://schemas.openxmlformats.org/drawingml/2006/picture">
                 <pic:pic xmlns:pic="http://schemas.openxmlformats.org/drawingml/2006/picture">
                   <pic:nvPicPr>
-                    <pic:cNvPr id="2026513207" name=""/>
+                    <pic:cNvPr id="1" name=""/>
                     <pic:cNvPicPr/>
                   </pic:nvPicPr>
                   <pic:blipFill>
@@ -36,7 +58,7 @@
                   <pic:spPr>
                     <a:xfrm>
                       <a:off x="0" y="0"/>
-                      <a:ext cx="5731510" cy="2618740"/>
+                      <a:ext cx="3234171" cy="6265449"/>
                     </a:xfrm>
                     <a:prstGeom prst="rect">
                       <a:avLst/>
@@ -49,22 +71,67 @@
         </w:drawing>
       </w:r>
     </w:p>
-    <w:p>
-      <w:r>
-        <w:t>Javascript:</w:t>
-      </w:r>
-    </w:p>
-    <w:p>
-      <w:r>
-        <w:rPr>
-          <w:noProof/>
-        </w:rPr>
-        <w:lastRenderedPageBreak/>
+    <w:p/>
+    <w:p/>
+    <w:p/>
+    <w:p/>
+    <w:p/>
+    <w:p/>
+    <w:p/>
+    <w:p>
+      <w:pPr>
+        <w:pStyle w:val="Heading2"/>
+      </w:pPr>
+      <w:r>
+        <w:t>Function</w:t>
+      </w:r>
+      <w:r>
+        <w:t>s</w:t>
+      </w:r>
+      <w:r>
+        <w:t xml:space="preserve"> – Display Student Information and Validate Results</w:t>
+      </w:r>
+      <w:r>
+        <w:t>:</w:t>
+      </w:r>
+    </w:p>
+    <w:p>
+      <w:pPr>
+        <w:pStyle w:val="Heading3"/>
+      </w:pPr>
+      <w:r>
+        <w:t>v</w:t>
+      </w:r>
+      <w:r>
+        <w:t>alidateLearner(learner)</w:t>
+      </w:r>
+    </w:p>
+    <w:p>
+      <w:r>
+        <w:t>Checks that a learner's score and at</w:t>
+      </w:r>
+      <w:r>
+        <w:t>tendance are realistic (0-100).</w:t>
+      </w:r>
+    </w:p>
+    <w:p>
+      <w:r>
+        <w:t>Returns an object describing wheth</w:t>
+      </w:r>
+      <w:r>
+        <w:t xml:space="preserve">er the learner's data is valid, </w:t>
+      </w:r>
+      <w:r>
+        <w:t>and a list of any problems found.</w:t>
+      </w:r>
+    </w:p>
+    <w:p>
+      <w:r>
         <w:drawing>
-          <wp:inline distT="0" distB="0" distL="0" distR="0" wp14:anchorId="646A2063" wp14:editId="7BA09AF9">
-            <wp:extent cx="5731510" cy="7569200"/>
+          <wp:inline distT="0" distB="0" distL="0" distR="0" wp14:anchorId="456E6BFA" wp14:editId="25B482EF">
+            <wp:extent cx="5731510" cy="2044700"/>
             <wp:effectExtent l="0" t="0" r="2540" b="0"/>
-            <wp:docPr id="1675811961" name="Picture 1"/>
+            <wp:docPr id="3" name="Picture 3"/>
             <wp:cNvGraphicFramePr>
               <a:graphicFrameLocks xmlns:a="http://schemas.openxmlformats.org/drawingml/2006/main" noChangeAspect="1"/>
             </wp:cNvGraphicFramePr>
@@ -72,7 +139,7 @@
               <a:graphicData uri="http://schemas.openxmlformats.org/drawingml/2006/picture">
                 <pic:pic xmlns:pic="http://schemas.openxmlformats.org/drawingml/2006/picture">
                   <pic:nvPicPr>
-                    <pic:cNvPr id="1675811961" name=""/>
+                    <pic:cNvPr id="1" name=""/>
                     <pic:cNvPicPr/>
                   </pic:nvPicPr>
                   <pic:blipFill>
@@ -84,7 +151,7 @@
                   <pic:spPr>
                     <a:xfrm>
                       <a:off x="0" y="0"/>
-                      <a:ext cx="5731510" cy="7569200"/>
+                      <a:ext cx="5731510" cy="2044700"/>
                     </a:xfrm>
                     <a:prstGeom prst="rect">
                       <a:avLst/>
@@ -98,16 +165,53 @@
       </w:r>
     </w:p>
     <w:p>
-      <w:r>
+      <w:pPr>
         <w:rPr>
-          <w:noProof/>
+          <w:b/>
         </w:rPr>
-        <w:lastRenderedPageBreak/>
+      </w:pPr>
+    </w:p>
+    <w:p>
+      <w:pPr>
+        <w:pStyle w:val="Heading3"/>
+      </w:pPr>
+      <w:r>
+        <w:t>g</w:t>
+      </w:r>
+      <w:r>
+        <w:t>etLearnerStatus(learner)</w:t>
+      </w:r>
+    </w:p>
+    <w:p>
+      <w:r>
+        <w:t>If score is above or equal to 80 and attendance is above or equal to 90 and must have</w:t>
+      </w:r>
+      <w:r>
+        <w:t xml:space="preserve"> submitted is true = Excellent. </w:t>
+      </w:r>
+      <w:r>
+        <w:t>If score is above or equal to 50 and attendance is above or equal to 80 and must have</w:t>
+      </w:r>
+      <w:r>
+        <w:t xml:space="preserve"> submitted is true = Competent. </w:t>
+      </w:r>
+      <w:r>
+        <w:t xml:space="preserve">If none of the criteria is </w:t>
+      </w:r>
+      <w:r>
+        <w:t>met,</w:t>
+      </w:r>
+      <w:r>
+        <w:t xml:space="preserve"> then return Not Yet Competent</w:t>
+      </w:r>
+    </w:p>
+    <w:p>
+      <w:r>
         <w:drawing>
-          <wp:inline distT="0" distB="0" distL="0" distR="0" wp14:anchorId="7AC139DB" wp14:editId="424D6E66">
-            <wp:extent cx="5731510" cy="1826260"/>
-            <wp:effectExtent l="0" t="0" r="2540" b="2540"/>
-            <wp:docPr id="861255314" name="Picture 1"/>
+          <wp:inline distT="0" distB="0" distL="0" distR="0" wp14:anchorId="128873E6" wp14:editId="7865DE3B">
+            <wp:extent cx="5731510" cy="1985645"/>
+            <wp:effectExtent l="0" t="0" r="2540" b="0"/>
+            <wp:docPr id="5" name="Picture 5"/>
             <wp:cNvGraphicFramePr>
               <a:graphicFrameLocks xmlns:a="http://schemas.openxmlformats.org/drawingml/2006/main" noChangeAspect="1"/>
             </wp:cNvGraphicFramePr>
@@ -115,7 +219,7 @@
               <a:graphicData uri="http://schemas.openxmlformats.org/drawingml/2006/picture">
                 <pic:pic xmlns:pic="http://schemas.openxmlformats.org/drawingml/2006/picture">
                   <pic:nvPicPr>
-                    <pic:cNvPr id="861255314" name=""/>
+                    <pic:cNvPr id="1" name=""/>
                     <pic:cNvPicPr/>
                   </pic:nvPicPr>
                   <pic:blipFill>
@@ -127,7 +231,7 @@
                   <pic:spPr>
                     <a:xfrm>
                       <a:off x="0" y="0"/>
-                      <a:ext cx="5731510" cy="1826260"/>
+                      <a:ext cx="5731510" cy="1985645"/>
                     </a:xfrm>
                     <a:prstGeom prst="rect">
                       <a:avLst/>
@@ -140,22 +244,38 @@
         </w:drawing>
       </w:r>
     </w:p>
-    <w:p>
-      <w:r>
-        <w:t>Output:</w:t>
-      </w:r>
-    </w:p>
-    <w:p>
-      <w:r>
-        <w:rPr>
-          <w:noProof/>
-        </w:rPr>
-        <w:lastRenderedPageBreak/>
+    <w:p/>
+    <w:p>
+      <w:pPr>
+        <w:pStyle w:val="Heading3"/>
+      </w:pPr>
+      <w:r>
+        <w:t>d</w:t>
+      </w:r>
+      <w:r>
+        <w:t>isplayLearner(learner, status)</w:t>
+      </w:r>
+    </w:p>
+    <w:p>
+      <w:r>
+        <w:t xml:space="preserve">Display learner information in the </w:t>
+      </w:r>
+      <w:proofErr w:type="gramStart"/>
+      <w:r>
+        <w:t>console.log(</w:t>
+      </w:r>
+      <w:proofErr w:type="gramEnd"/>
+      <w:r>
+        <w:t>)</w:t>
+      </w:r>
+    </w:p>
+    <w:p>
+      <w:r>
         <w:drawing>
-          <wp:inline distT="0" distB="0" distL="0" distR="0" wp14:anchorId="2320E8C9" wp14:editId="7DBAB72A">
-            <wp:extent cx="5731510" cy="6925310"/>
-            <wp:effectExtent l="0" t="0" r="2540" b="8890"/>
-            <wp:docPr id="229484799" name="Picture 1"/>
+          <wp:inline distT="0" distB="0" distL="0" distR="0" wp14:anchorId="319D6088" wp14:editId="725EF4C0">
+            <wp:extent cx="5731510" cy="1846580"/>
+            <wp:effectExtent l="0" t="0" r="2540" b="1270"/>
+            <wp:docPr id="6" name="Picture 6"/>
             <wp:cNvGraphicFramePr>
               <a:graphicFrameLocks xmlns:a="http://schemas.openxmlformats.org/drawingml/2006/main" noChangeAspect="1"/>
             </wp:cNvGraphicFramePr>
@@ -163,7 +283,7 @@
               <a:graphicData uri="http://schemas.openxmlformats.org/drawingml/2006/picture">
                 <pic:pic xmlns:pic="http://schemas.openxmlformats.org/drawingml/2006/picture">
                   <pic:nvPicPr>
-                    <pic:cNvPr id="229484799" name=""/>
+                    <pic:cNvPr id="1" name=""/>
                     <pic:cNvPicPr/>
                   </pic:nvPicPr>
                   <pic:blipFill>
@@ -175,7 +295,7 @@
                   <pic:spPr>
                     <a:xfrm>
                       <a:off x="0" y="0"/>
-                      <a:ext cx="5731510" cy="6925310"/>
+                      <a:ext cx="5731510" cy="1846580"/>
                     </a:xfrm>
                     <a:prstGeom prst="rect">
                       <a:avLst/>
@@ -190,26 +310,43 @@
     </w:p>
     <w:p/>
     <w:p>
-      <w:r>
-        <w:t>Added logic to read from the HTML page and redid the function to be actioned from the button click:</w:t>
-      </w:r>
-    </w:p>
-    <w:p>
-      <w:r>
-        <w:t>HTML:</w:t>
-      </w:r>
-    </w:p>
-    <w:p>
-      <w:r>
-        <w:rPr>
-          <w:noProof/>
-        </w:rPr>
-        <w:lastRenderedPageBreak/>
+      <w:pPr>
+        <w:pStyle w:val="Heading3"/>
+      </w:pPr>
+      <w:r>
+        <w:t>p</w:t>
+      </w:r>
+      <w:r>
+        <w:t>rocessAllLearners(learnerList)</w:t>
+      </w:r>
+    </w:p>
+    <w:p>
+      <w:r>
+        <w:t>Loops through the learner’s array once, displaying each valid learner and builds the structure required for the summary breakdown.</w:t>
+      </w:r>
+    </w:p>
+    <w:p>
+      <w:r>
+        <w:t>Checks invalid entries and is pushed to a new array called invalidLearners.</w:t>
+      </w:r>
+    </w:p>
+    <w:p>
+      <w:r>
+        <w:t>Calculations are done here to determine how many entries exist for each criteria</w:t>
+      </w:r>
+    </w:p>
+    <w:p>
+      <w:r>
+        <w:t>Returns values once Function is executed.</w:t>
+      </w:r>
+    </w:p>
+    <w:p>
+      <w:r>
         <w:drawing>
-          <wp:inline distT="0" distB="0" distL="0" distR="0" wp14:anchorId="1BA65C17" wp14:editId="5436747A">
-            <wp:extent cx="5731510" cy="3117215"/>
-            <wp:effectExtent l="0" t="0" r="2540" b="6985"/>
-            <wp:docPr id="933914615" name="Picture 1"/>
+          <wp:inline distT="0" distB="0" distL="0" distR="0" wp14:anchorId="7080C77A" wp14:editId="297FEF31">
+            <wp:extent cx="5324475" cy="3942920"/>
+            <wp:effectExtent l="0" t="0" r="0" b="635"/>
+            <wp:docPr id="7" name="Picture 7"/>
             <wp:cNvGraphicFramePr>
               <a:graphicFrameLocks xmlns:a="http://schemas.openxmlformats.org/drawingml/2006/main" noChangeAspect="1"/>
             </wp:cNvGraphicFramePr>
@@ -217,7 +354,7 @@
               <a:graphicData uri="http://schemas.openxmlformats.org/drawingml/2006/picture">
                 <pic:pic xmlns:pic="http://schemas.openxmlformats.org/drawingml/2006/picture">
                   <pic:nvPicPr>
-                    <pic:cNvPr id="933914615" name=""/>
+                    <pic:cNvPr id="1" name=""/>
                     <pic:cNvPicPr/>
                   </pic:nvPicPr>
                   <pic:blipFill>
@@ -229,7 +366,7 @@
                   <pic:spPr>
                     <a:xfrm>
                       <a:off x="0" y="0"/>
-                      <a:ext cx="5731510" cy="3117215"/>
+                      <a:ext cx="5347557" cy="3960013"/>
                     </a:xfrm>
                     <a:prstGeom prst="rect">
                       <a:avLst/>
@@ -243,20 +380,20 @@
       </w:r>
     </w:p>
     <w:p>
-      <w:r>
-        <w:t>JS:</w:t>
-      </w:r>
-    </w:p>
-    <w:p>
-      <w:r>
-        <w:rPr>
-          <w:noProof/>
-        </w:rPr>
+      <w:pPr>
+        <w:pStyle w:val="Heading3"/>
+      </w:pPr>
+      <w:r>
+        <w:t>Test Evidence:</w:t>
+      </w:r>
+    </w:p>
+    <w:p>
+      <w:r>
         <w:drawing>
-          <wp:inline distT="0" distB="0" distL="0" distR="0" wp14:anchorId="7D723D4B" wp14:editId="1B0C463B">
-            <wp:extent cx="5731510" cy="5083175"/>
-            <wp:effectExtent l="0" t="0" r="2540" b="3175"/>
-            <wp:docPr id="1131808405" name="Picture 1"/>
+          <wp:inline distT="0" distB="0" distL="0" distR="0" wp14:anchorId="37A5679A" wp14:editId="4233598A">
+            <wp:extent cx="5731510" cy="6982460"/>
+            <wp:effectExtent l="0" t="0" r="2540" b="8890"/>
+            <wp:docPr id="9" name="Picture 9"/>
             <wp:cNvGraphicFramePr>
               <a:graphicFrameLocks xmlns:a="http://schemas.openxmlformats.org/drawingml/2006/main" noChangeAspect="1"/>
             </wp:cNvGraphicFramePr>
@@ -264,7 +401,7 @@
               <a:graphicData uri="http://schemas.openxmlformats.org/drawingml/2006/picture">
                 <pic:pic xmlns:pic="http://schemas.openxmlformats.org/drawingml/2006/picture">
                   <pic:nvPicPr>
-                    <pic:cNvPr id="1131808405" name=""/>
+                    <pic:cNvPr id="1" name=""/>
                     <pic:cNvPicPr/>
                   </pic:nvPicPr>
                   <pic:blipFill>
@@ -276,7 +413,7 @@
                   <pic:spPr>
                     <a:xfrm>
                       <a:off x="0" y="0"/>
-                      <a:ext cx="5731510" cy="5083175"/>
+                      <a:ext cx="5731510" cy="6982460"/>
                     </a:xfrm>
                     <a:prstGeom prst="rect">
                       <a:avLst/>
@@ -289,21 +426,49 @@
         </w:drawing>
       </w:r>
     </w:p>
-    <w:p/>
-    <w:p/>
-    <w:p>
-      <w:r>
-        <w:t xml:space="preserve">Error experienced: </w:t>
-      </w:r>
-      <w:r>
-        <w:rPr>
-          <w:noProof/>
-        </w:rPr>
+    <w:p>
+      <w:pPr>
+        <w:pStyle w:val="Heading2"/>
+      </w:pPr>
+      <w:r>
+        <w:t>Functions – C</w:t>
+      </w:r>
+      <w:bookmarkStart w:id="0" w:name="_GoBack"/>
+      <w:bookmarkEnd w:id="0"/>
+      <w:r>
+        <w:t>alculations:</w:t>
+      </w:r>
+    </w:p>
+    <w:p>
+      <w:pPr>
+        <w:pStyle w:val="Heading3"/>
+      </w:pPr>
+      <w:proofErr w:type="spellStart"/>
+      <w:proofErr w:type="gramStart"/>
+      <w:r>
+        <w:t>calculateAverage</w:t>
+      </w:r>
+      <w:proofErr w:type="spellEnd"/>
+      <w:r>
+        <w:t>(</w:t>
+      </w:r>
+      <w:proofErr w:type="gramEnd"/>
+      <w:r>
+        <w:t>total, count)</w:t>
+      </w:r>
+    </w:p>
+    <w:p>
+      <w:r>
+        <w:t>calculates average totals and returns as string and a single decimal point</w:t>
+      </w:r>
+    </w:p>
+    <w:p>
+      <w:r>
         <w:drawing>
-          <wp:inline distT="0" distB="0" distL="0" distR="0" wp14:anchorId="26DFDFC1" wp14:editId="1AC0D556">
-            <wp:extent cx="5731510" cy="1719580"/>
-            <wp:effectExtent l="0" t="0" r="2540" b="0"/>
-            <wp:docPr id="1905040604" name="Picture 1"/>
+          <wp:inline distT="0" distB="0" distL="0" distR="0" wp14:anchorId="674C8B22" wp14:editId="6160D17C">
+            <wp:extent cx="5731510" cy="1254760"/>
+            <wp:effectExtent l="0" t="0" r="2540" b="2540"/>
+            <wp:docPr id="8" name="Picture 8"/>
             <wp:cNvGraphicFramePr>
               <a:graphicFrameLocks xmlns:a="http://schemas.openxmlformats.org/drawingml/2006/main" noChangeAspect="1"/>
             </wp:cNvGraphicFramePr>
@@ -311,7 +476,7 @@
               <a:graphicData uri="http://schemas.openxmlformats.org/drawingml/2006/picture">
                 <pic:pic xmlns:pic="http://schemas.openxmlformats.org/drawingml/2006/picture">
                   <pic:nvPicPr>
-                    <pic:cNvPr id="1905040604" name=""/>
+                    <pic:cNvPr id="1" name=""/>
                     <pic:cNvPicPr/>
                   </pic:nvPicPr>
                   <pic:blipFill>
@@ -323,7 +488,7 @@
                   <pic:spPr>
                     <a:xfrm>
                       <a:off x="0" y="0"/>
-                      <a:ext cx="5731510" cy="1719580"/>
+                      <a:ext cx="5731510" cy="1254760"/>
                     </a:xfrm>
                     <a:prstGeom prst="rect">
                       <a:avLst/>
@@ -337,313 +502,7 @@
       </w:r>
     </w:p>
     <w:p/>
-    <w:p>
-      <w:r>
-        <w:t>Issue found to be the following code snippet:</w:t>
-      </w:r>
-    </w:p>
-    <w:p>
-      <w:r>
-        <w:rPr>
-          <w:noProof/>
-        </w:rPr>
-        <w:drawing>
-          <wp:inline distT="0" distB="0" distL="0" distR="0" wp14:anchorId="51FD517C" wp14:editId="5583278C">
-            <wp:extent cx="5731510" cy="940435"/>
-            <wp:effectExtent l="0" t="0" r="2540" b="0"/>
-            <wp:docPr id="706284493" name="Picture 1"/>
-            <wp:cNvGraphicFramePr>
-              <a:graphicFrameLocks xmlns:a="http://schemas.openxmlformats.org/drawingml/2006/main" noChangeAspect="1"/>
-            </wp:cNvGraphicFramePr>
-            <a:graphic xmlns:a="http://schemas.openxmlformats.org/drawingml/2006/main">
-              <a:graphicData uri="http://schemas.openxmlformats.org/drawingml/2006/picture">
-                <pic:pic xmlns:pic="http://schemas.openxmlformats.org/drawingml/2006/picture">
-                  <pic:nvPicPr>
-                    <pic:cNvPr id="706284493" name=""/>
-                    <pic:cNvPicPr/>
-                  </pic:nvPicPr>
-                  <pic:blipFill>
-                    <a:blip r:embed="rId11"/>
-                    <a:stretch>
-                      <a:fillRect/>
-                    </a:stretch>
-                  </pic:blipFill>
-                  <pic:spPr>
-                    <a:xfrm>
-                      <a:off x="0" y="0"/>
-                      <a:ext cx="5731510" cy="940435"/>
-                    </a:xfrm>
-                    <a:prstGeom prst="rect">
-                      <a:avLst/>
-                    </a:prstGeom>
-                  </pic:spPr>
-                </pic:pic>
-              </a:graphicData>
-            </a:graphic>
-          </wp:inline>
-        </w:drawing>
-      </w:r>
-    </w:p>
-    <w:p>
-      <w:r>
-        <w:t xml:space="preserve">Changed it to be </w:t>
-      </w:r>
-    </w:p>
-    <w:p>
-      <w:r>
-        <w:rPr>
-          <w:i/>
-          <w:iCs/>
-        </w:rPr>
-        <w:t>const</w:t>
-      </w:r>
-      <w:r>
-        <w:t xml:space="preserve"> enteredStudentNumber  = textInput.trim().toUpperCase();</w:t>
-      </w:r>
-    </w:p>
     <w:p/>
-    <w:p>
-      <w:r>
-        <w:t>Got a new error:</w:t>
-      </w:r>
-    </w:p>
-    <w:p>
-      <w:r>
-        <w:rPr>
-          <w:noProof/>
-        </w:rPr>
-        <w:drawing>
-          <wp:inline distT="0" distB="0" distL="0" distR="0" wp14:anchorId="1D632450" wp14:editId="7D63F009">
-            <wp:extent cx="5731510" cy="1627505"/>
-            <wp:effectExtent l="0" t="0" r="2540" b="0"/>
-            <wp:docPr id="95613645" name="Picture 1"/>
-            <wp:cNvGraphicFramePr>
-              <a:graphicFrameLocks xmlns:a="http://schemas.openxmlformats.org/drawingml/2006/main" noChangeAspect="1"/>
-            </wp:cNvGraphicFramePr>
-            <a:graphic xmlns:a="http://schemas.openxmlformats.org/drawingml/2006/main">
-              <a:graphicData uri="http://schemas.openxmlformats.org/drawingml/2006/picture">
-                <pic:pic xmlns:pic="http://schemas.openxmlformats.org/drawingml/2006/picture">
-                  <pic:nvPicPr>
-                    <pic:cNvPr id="95613645" name=""/>
-                    <pic:cNvPicPr/>
-                  </pic:nvPicPr>
-                  <pic:blipFill>
-                    <a:blip r:embed="rId12"/>
-                    <a:stretch>
-                      <a:fillRect/>
-                    </a:stretch>
-                  </pic:blipFill>
-                  <pic:spPr>
-                    <a:xfrm>
-                      <a:off x="0" y="0"/>
-                      <a:ext cx="5731510" cy="1627505"/>
-                    </a:xfrm>
-                    <a:prstGeom prst="rect">
-                      <a:avLst/>
-                    </a:prstGeom>
-                  </pic:spPr>
-                </pic:pic>
-              </a:graphicData>
-            </a:graphic>
-          </wp:inline>
-        </w:drawing>
-      </w:r>
-    </w:p>
-    <w:p/>
-    <w:p>
-      <w:r>
-        <w:t>Had to add the value im passing in the code:</w:t>
-      </w:r>
-    </w:p>
-    <w:p>
-      <w:r>
-        <w:rPr>
-          <w:i/>
-          <w:iCs/>
-        </w:rPr>
-        <w:t>const</w:t>
-      </w:r>
-      <w:r>
-        <w:t xml:space="preserve"> enteredStudentNumber  = textInput.value.trim().toUpperCase();</w:t>
-      </w:r>
-    </w:p>
-    <w:p>
-      <w:r>
-        <w:lastRenderedPageBreak/>
-        <w:t xml:space="preserve">After passing the value the result is as expected: </w:t>
-      </w:r>
-      <w:r>
-        <w:rPr>
-          <w:noProof/>
-        </w:rPr>
-        <w:drawing>
-          <wp:inline distT="0" distB="0" distL="0" distR="0" wp14:anchorId="07ED8435" wp14:editId="34A3AA07">
-            <wp:extent cx="5731510" cy="1567815"/>
-            <wp:effectExtent l="0" t="0" r="2540" b="0"/>
-            <wp:docPr id="1091625379" name="Picture 1"/>
-            <wp:cNvGraphicFramePr>
-              <a:graphicFrameLocks xmlns:a="http://schemas.openxmlformats.org/drawingml/2006/main" noChangeAspect="1"/>
-            </wp:cNvGraphicFramePr>
-            <a:graphic xmlns:a="http://schemas.openxmlformats.org/drawingml/2006/main">
-              <a:graphicData uri="http://schemas.openxmlformats.org/drawingml/2006/picture">
-                <pic:pic xmlns:pic="http://schemas.openxmlformats.org/drawingml/2006/picture">
-                  <pic:nvPicPr>
-                    <pic:cNvPr id="1091625379" name=""/>
-                    <pic:cNvPicPr/>
-                  </pic:nvPicPr>
-                  <pic:blipFill>
-                    <a:blip r:embed="rId13"/>
-                    <a:stretch>
-                      <a:fillRect/>
-                    </a:stretch>
-                  </pic:blipFill>
-                  <pic:spPr>
-                    <a:xfrm>
-                      <a:off x="0" y="0"/>
-                      <a:ext cx="5731510" cy="1567815"/>
-                    </a:xfrm>
-                    <a:prstGeom prst="rect">
-                      <a:avLst/>
-                    </a:prstGeom>
-                  </pic:spPr>
-                </pic:pic>
-              </a:graphicData>
-            </a:graphic>
-          </wp:inline>
-        </w:drawing>
-      </w:r>
-    </w:p>
-    <w:p>
-      <w:r>
-        <w:t>Added console logging:</w:t>
-      </w:r>
-    </w:p>
-    <w:p>
-      <w:r>
-        <w:rPr>
-          <w:noProof/>
-        </w:rPr>
-        <w:drawing>
-          <wp:inline distT="0" distB="0" distL="0" distR="0" wp14:anchorId="19BD7ADF" wp14:editId="308AF404">
-            <wp:extent cx="5731510" cy="1224280"/>
-            <wp:effectExtent l="0" t="0" r="2540" b="0"/>
-            <wp:docPr id="1495746263" name="Picture 1"/>
-            <wp:cNvGraphicFramePr>
-              <a:graphicFrameLocks xmlns:a="http://schemas.openxmlformats.org/drawingml/2006/main" noChangeAspect="1"/>
-            </wp:cNvGraphicFramePr>
-            <a:graphic xmlns:a="http://schemas.openxmlformats.org/drawingml/2006/main">
-              <a:graphicData uri="http://schemas.openxmlformats.org/drawingml/2006/picture">
-                <pic:pic xmlns:pic="http://schemas.openxmlformats.org/drawingml/2006/picture">
-                  <pic:nvPicPr>
-                    <pic:cNvPr id="1495746263" name=""/>
-                    <pic:cNvPicPr/>
-                  </pic:nvPicPr>
-                  <pic:blipFill>
-                    <a:blip r:embed="rId14"/>
-                    <a:stretch>
-                      <a:fillRect/>
-                    </a:stretch>
-                  </pic:blipFill>
-                  <pic:spPr>
-                    <a:xfrm>
-                      <a:off x="0" y="0"/>
-                      <a:ext cx="5731510" cy="1224280"/>
-                    </a:xfrm>
-                    <a:prstGeom prst="rect">
-                      <a:avLst/>
-                    </a:prstGeom>
-                  </pic:spPr>
-                </pic:pic>
-              </a:graphicData>
-            </a:graphic>
-          </wp:inline>
-        </w:drawing>
-      </w:r>
-    </w:p>
-    <w:p>
-      <w:r>
-        <w:rPr>
-          <w:noProof/>
-        </w:rPr>
-        <w:drawing>
-          <wp:inline distT="0" distB="0" distL="0" distR="0" wp14:anchorId="43BCC567" wp14:editId="5AA90512">
-            <wp:extent cx="5731510" cy="1323975"/>
-            <wp:effectExtent l="0" t="0" r="2540" b="9525"/>
-            <wp:docPr id="1958761636" name="Picture 1"/>
-            <wp:cNvGraphicFramePr>
-              <a:graphicFrameLocks xmlns:a="http://schemas.openxmlformats.org/drawingml/2006/main" noChangeAspect="1"/>
-            </wp:cNvGraphicFramePr>
-            <a:graphic xmlns:a="http://schemas.openxmlformats.org/drawingml/2006/main">
-              <a:graphicData uri="http://schemas.openxmlformats.org/drawingml/2006/picture">
-                <pic:pic xmlns:pic="http://schemas.openxmlformats.org/drawingml/2006/picture">
-                  <pic:nvPicPr>
-                    <pic:cNvPr id="1958761636" name=""/>
-                    <pic:cNvPicPr/>
-                  </pic:nvPicPr>
-                  <pic:blipFill>
-                    <a:blip r:embed="rId15"/>
-                    <a:stretch>
-                      <a:fillRect/>
-                    </a:stretch>
-                  </pic:blipFill>
-                  <pic:spPr>
-                    <a:xfrm>
-                      <a:off x="0" y="0"/>
-                      <a:ext cx="5731510" cy="1323975"/>
-                    </a:xfrm>
-                    <a:prstGeom prst="rect">
-                      <a:avLst/>
-                    </a:prstGeom>
-                  </pic:spPr>
-                </pic:pic>
-              </a:graphicData>
-            </a:graphic>
-          </wp:inline>
-        </w:drawing>
-      </w:r>
-    </w:p>
-    <w:p>
-      <w:r>
-        <w:rPr>
-          <w:noProof/>
-        </w:rPr>
-        <w:drawing>
-          <wp:inline distT="0" distB="0" distL="0" distR="0" wp14:anchorId="2272B4C0" wp14:editId="0761596C">
-            <wp:extent cx="5731510" cy="1219200"/>
-            <wp:effectExtent l="0" t="0" r="2540" b="0"/>
-            <wp:docPr id="572314055" name="Picture 1"/>
-            <wp:cNvGraphicFramePr>
-              <a:graphicFrameLocks xmlns:a="http://schemas.openxmlformats.org/drawingml/2006/main" noChangeAspect="1"/>
-            </wp:cNvGraphicFramePr>
-            <a:graphic xmlns:a="http://schemas.openxmlformats.org/drawingml/2006/main">
-              <a:graphicData uri="http://schemas.openxmlformats.org/drawingml/2006/picture">
-                <pic:pic xmlns:pic="http://schemas.openxmlformats.org/drawingml/2006/picture">
-                  <pic:nvPicPr>
-                    <pic:cNvPr id="572314055" name=""/>
-                    <pic:cNvPicPr/>
-                  </pic:nvPicPr>
-                  <pic:blipFill>
-                    <a:blip r:embed="rId16"/>
-                    <a:stretch>
-                      <a:fillRect/>
-                    </a:stretch>
-                  </pic:blipFill>
-                  <pic:spPr>
-                    <a:xfrm>
-                      <a:off x="0" y="0"/>
-                      <a:ext cx="5731510" cy="1219200"/>
-                    </a:xfrm>
-                    <a:prstGeom prst="rect">
-                      <a:avLst/>
-                    </a:prstGeom>
-                  </pic:spPr>
-                </pic:pic>
-              </a:graphicData>
-            </a:graphic>
-          </wp:inline>
-        </w:drawing>
-      </w:r>
-    </w:p>
     <w:sectPr>
       <w:pgSz w:w="11906" w:h="16838"/>
       <w:pgMar w:top="1440" w:right="1440" w:bottom="1440" w:left="1440" w:header="708" w:footer="708" w:gutter="0"/>
@@ -655,7 +514,7 @@
 </file>
 
 <file path=word/styles.xml><?xml version="1.0" encoding="utf-8"?>
-<w:styles xmlns:mc="http://schemas.openxmlformats.org/markup-compatibility/2006" xmlns:r="http://schemas.openxmlformats.org/officeDocument/2006/relationships" xmlns:w="http://schemas.openxmlformats.org/wordprocessingml/2006/main" xmlns:w14="http://schemas.microsoft.com/office/word/2010/wordml" xmlns:w15="http://schemas.microsoft.com/office/word/2012/wordml" xmlns:w16cex="http://schemas.microsoft.com/office/word/2018/wordml/cex" xmlns:w16cid="http://schemas.microsoft.com/office/word/2016/wordml/cid" xmlns:w16="http://schemas.microsoft.com/office/word/2018/wordml" xmlns:w16du="http://schemas.microsoft.com/office/word/2023/wordml/word16du" xmlns:w16sdtdh="http://schemas.microsoft.com/office/word/2020/wordml/sdtdatahash" xmlns:w16sdtfl="http://schemas.microsoft.com/office/word/2024/wordml/sdtformatlock" xmlns:w16se="http://schemas.microsoft.com/office/word/2015/wordml/symex" mc:Ignorable="w14 w15 w16se w16cid w16 w16cex w16sdtdh w16sdtfl w16du">
+<w:styles xmlns:mc="http://schemas.openxmlformats.org/markup-compatibility/2006" xmlns:r="http://schemas.openxmlformats.org/officeDocument/2006/relationships" xmlns:w="http://schemas.openxmlformats.org/wordprocessingml/2006/main" xmlns:w14="http://schemas.microsoft.com/office/word/2010/wordml" xmlns:w15="http://schemas.microsoft.com/office/word/2012/wordml" xmlns:w16se="http://schemas.microsoft.com/office/word/2015/wordml/symex" mc:Ignorable="w14 w15 w16se">
   <w:docDefaults>
     <w:rPrDefault>
       <w:rPr>
@@ -673,7 +532,7 @@
       </w:pPr>
     </w:pPrDefault>
   </w:docDefaults>
-  <w:latentStyles w:defLockedState="0" w:defUIPriority="99" w:defSemiHidden="0" w:defUnhideWhenUsed="0" w:defQFormat="0" w:count="376">
+  <w:latentStyles w:defLockedState="0" w:defUIPriority="99" w:defSemiHidden="0" w:defUnhideWhenUsed="0" w:defQFormat="0" w:count="371">
     <w:lsdException w:name="Normal" w:uiPriority="0" w:qFormat="1"/>
     <w:lsdException w:name="heading 1" w:uiPriority="9" w:qFormat="1"/>
     <w:lsdException w:name="heading 2" w:semiHidden="1" w:uiPriority="9" w:unhideWhenUsed="1" w:qFormat="1"/>
@@ -1045,11 +904,6 @@
     <w:lsdException w:name="List Table 5 Dark Accent 6" w:uiPriority="50"/>
     <w:lsdException w:name="List Table 6 Colorful Accent 6" w:uiPriority="51"/>
     <w:lsdException w:name="List Table 7 Colorful Accent 6" w:uiPriority="52"/>
-    <w:lsdException w:name="Mention" w:semiHidden="1" w:unhideWhenUsed="1"/>
-    <w:lsdException w:name="Smart Hyperlink" w:semiHidden="1" w:unhideWhenUsed="1"/>
-    <w:lsdException w:name="Hashtag" w:semiHidden="1" w:unhideWhenUsed="1"/>
-    <w:lsdException w:name="Unresolved Mention" w:semiHidden="1" w:unhideWhenUsed="1"/>
-    <w:lsdException w:name="Smart Link" w:semiHidden="1" w:unhideWhenUsed="1"/>
   </w:latentStyles>
   <w:style w:type="paragraph" w:default="1" w:styleId="Normal">
     <w:name w:val="Normal"/>
@@ -1082,7 +936,6 @@
     <w:next w:val="Normal"/>
     <w:link w:val="Heading2Char"/>
     <w:uiPriority w:val="9"/>
-    <w:semiHidden/>
     <w:unhideWhenUsed/>
     <w:qFormat/>
     <w:rsid w:val="007C48A6"/>
@@ -1105,7 +958,6 @@
     <w:next w:val="Normal"/>
     <w:link w:val="Heading3Char"/>
     <w:uiPriority w:val="9"/>
-    <w:semiHidden/>
     <w:unhideWhenUsed/>
     <w:qFormat/>
     <w:rsid w:val="007C48A6"/>
@@ -1128,7 +980,6 @@
     <w:next w:val="Normal"/>
     <w:link w:val="Heading4Char"/>
     <w:uiPriority w:val="9"/>
-    <w:semiHidden/>
     <w:unhideWhenUsed/>
     <w:qFormat/>
     <w:rsid w:val="007C48A6"/>
@@ -1257,6 +1108,7 @@
   <w:style w:type="character" w:default="1" w:styleId="DefaultParagraphFont">
     <w:name w:val="Default Paragraph Font"/>
     <w:uiPriority w:val="1"/>
+    <w:semiHidden/>
     <w:unhideWhenUsed/>
   </w:style>
   <w:style w:type="table" w:default="1" w:styleId="TableNormal">
@@ -1298,7 +1150,6 @@
     <w:basedOn w:val="DefaultParagraphFont"/>
     <w:link w:val="Heading2"/>
     <w:uiPriority w:val="9"/>
-    <w:semiHidden/>
     <w:rsid w:val="007C48A6"/>
     <w:rPr>
       <w:rFonts w:asciiTheme="majorHAnsi" w:eastAsiaTheme="majorEastAsia" w:hAnsiTheme="majorHAnsi" w:cstheme="majorBidi"/>
@@ -1312,7 +1163,6 @@
     <w:basedOn w:val="DefaultParagraphFont"/>
     <w:link w:val="Heading3"/>
     <w:uiPriority w:val="9"/>
-    <w:semiHidden/>
     <w:rsid w:val="007C48A6"/>
     <w:rPr>
       <w:rFonts w:eastAsiaTheme="majorEastAsia" w:cstheme="majorBidi"/>
@@ -1326,7 +1176,6 @@
     <w:basedOn w:val="DefaultParagraphFont"/>
     <w:link w:val="Heading4"/>
     <w:uiPriority w:val="9"/>
-    <w:semiHidden/>
     <w:rsid w:val="007C48A6"/>
     <w:rPr>
       <w:rFonts w:eastAsiaTheme="majorEastAsia" w:cstheme="majorBidi"/>

</xml_diff>

<commit_message>
JavaScript has been completed and tested
</commit_message>
<xml_diff>
--- a/PM-02/learner-performance-tracker/evidence/testing.docx
+++ b/PM-02/learner-performance-tracker/evidence/testing.docx
@@ -10,6 +10,7 @@
         <w:t>HTML Code Snippets:</w:t>
       </w:r>
     </w:p>
+    <w:p/>
     <w:p>
       <w:pPr>
         <w:pStyle w:val="Heading1"/>
@@ -34,6 +35,10 @@
     </w:p>
     <w:p>
       <w:r>
+        <w:rPr>
+          <w:noProof/>
+          <w:lang w:val="en-US"/>
+        </w:rPr>
         <w:drawing>
           <wp:inline distT="0" distB="0" distL="0" distR="0" wp14:anchorId="22A51B58" wp14:editId="02B2D4F2">
             <wp:extent cx="3214328" cy="6227008"/>
@@ -89,7 +94,12 @@
         <w:t>s</w:t>
       </w:r>
       <w:r>
-        <w:t xml:space="preserve"> – Display Student Information and Validate Results</w:t>
+        <w:t xml:space="preserve"> – Display</w:t>
+      </w:r>
+      <w:bookmarkStart w:id="0" w:name="_GoBack"/>
+      <w:bookmarkEnd w:id="0"/>
+      <w:r>
+        <w:t xml:space="preserve"> Student Information and Validate Results</w:t>
       </w:r>
       <w:r>
         <w:t>:</w:t>
@@ -108,25 +118,20 @@
     </w:p>
     <w:p>
       <w:r>
-        <w:t>Checks that a learner's score and at</w:t>
-      </w:r>
-      <w:r>
-        <w:t>tendance are realistic (0-100).</w:t>
-      </w:r>
-    </w:p>
-    <w:p>
-      <w:r>
-        <w:t>Returns an object describing wheth</w:t>
-      </w:r>
-      <w:r>
-        <w:t xml:space="preserve">er the learner's data is valid, </w:t>
-      </w:r>
-      <w:r>
-        <w:t>and a list of any problems found.</w:t>
-      </w:r>
-    </w:p>
-    <w:p>
-      <w:r>
+        <w:t>Checks that a learner's score and attendance are realistic (0-100).</w:t>
+      </w:r>
+    </w:p>
+    <w:p>
+      <w:r>
+        <w:t>Returns an object describing whether the learner's data is valid, and a list of any problems found.</w:t>
+      </w:r>
+    </w:p>
+    <w:p>
+      <w:r>
+        <w:rPr>
+          <w:noProof/>
+          <w:lang w:val="en-US"/>
+        </w:rPr>
         <w:drawing>
           <wp:inline distT="0" distB="0" distL="0" distR="0" wp14:anchorId="456E6BFA" wp14:editId="25B482EF">
             <wp:extent cx="5731510" cy="2044700"/>
@@ -184,29 +189,15 @@
     </w:p>
     <w:p>
       <w:r>
-        <w:t>If score is above or equal to 80 and attendance is above or equal to 90 and must have</w:t>
-      </w:r>
-      <w:r>
-        <w:t xml:space="preserve"> submitted is true = Excellent. </w:t>
-      </w:r>
-      <w:r>
-        <w:t>If score is above or equal to 50 and attendance is above or equal to 80 and must have</w:t>
-      </w:r>
-      <w:r>
-        <w:t xml:space="preserve"> submitted is true = Competent. </w:t>
-      </w:r>
-      <w:r>
-        <w:t xml:space="preserve">If none of the criteria is </w:t>
-      </w:r>
-      <w:r>
-        <w:t>met,</w:t>
-      </w:r>
-      <w:r>
-        <w:t xml:space="preserve"> then return Not Yet Competent</w:t>
-      </w:r>
-    </w:p>
-    <w:p>
-      <w:r>
+        <w:t>If score is above or equal to 80 and attendance is above or equal to 90 and must have submitted is true = Excellent. If score is above or equal to 50 and attendance is above or equal to 80 and must have submitted is true = Competent. If none of the criteria is met, then return Not Yet Competent</w:t>
+      </w:r>
+    </w:p>
+    <w:p>
+      <w:r>
+        <w:rPr>
+          <w:noProof/>
+          <w:lang w:val="en-US"/>
+        </w:rPr>
         <w:drawing>
           <wp:inline distT="0" distB="0" distL="0" distR="0" wp14:anchorId="128873E6" wp14:editId="7865DE3B">
             <wp:extent cx="5731510" cy="1985645"/>
@@ -271,6 +262,10 @@
     </w:p>
     <w:p>
       <w:r>
+        <w:rPr>
+          <w:noProof/>
+          <w:lang w:val="en-US"/>
+        </w:rPr>
         <w:drawing>
           <wp:inline distT="0" distB="0" distL="0" distR="0" wp14:anchorId="319D6088" wp14:editId="725EF4C0">
             <wp:extent cx="5731510" cy="1846580"/>
@@ -342,6 +337,10 @@
     </w:p>
     <w:p>
       <w:r>
+        <w:rPr>
+          <w:noProof/>
+          <w:lang w:val="en-US"/>
+        </w:rPr>
         <w:drawing>
           <wp:inline distT="0" distB="0" distL="0" distR="0" wp14:anchorId="7080C77A" wp14:editId="297FEF31">
             <wp:extent cx="5324475" cy="3942920"/>
@@ -389,6 +388,10 @@
     </w:p>
     <w:p>
       <w:r>
+        <w:rPr>
+          <w:noProof/>
+          <w:lang w:val="en-US"/>
+        </w:rPr>
         <w:drawing>
           <wp:inline distT="0" distB="0" distL="0" distR="0" wp14:anchorId="37A5679A" wp14:editId="4233598A">
             <wp:extent cx="5731510" cy="6982460"/>
@@ -428,47 +431,32 @@
     </w:p>
     <w:p>
       <w:pPr>
-        <w:pStyle w:val="Heading2"/>
-      </w:pPr>
-      <w:r>
-        <w:t>Functions – C</w:t>
-      </w:r>
-      <w:bookmarkStart w:id="0" w:name="_GoBack"/>
-      <w:bookmarkEnd w:id="0"/>
-      <w:r>
-        <w:t>alculations:</w:t>
-      </w:r>
-    </w:p>
-    <w:p>
-      <w:pPr>
         <w:pStyle w:val="Heading3"/>
       </w:pPr>
-      <w:proofErr w:type="spellStart"/>
+      <w:r>
+        <w:t>displaySummary(stats)</w:t>
+      </w:r>
+    </w:p>
+    <w:p>
+      <w:r>
+        <w:t xml:space="preserve">will display the totals of learner results in the </w:t>
+      </w:r>
       <w:proofErr w:type="gramStart"/>
       <w:r>
-        <w:t>calculateAverage</w:t>
-      </w:r>
-      <w:proofErr w:type="spellEnd"/>
-      <w:r>
-        <w:t>(</w:t>
+        <w:t>console.log(</w:t>
       </w:r>
       <w:proofErr w:type="gramEnd"/>
       <w:r>
-        <w:t>total, count)</w:t>
-      </w:r>
-    </w:p>
-    <w:p>
-      <w:r>
-        <w:t>calculates average totals and returns as string and a single decimal point</w:t>
+        <w:t>)</w:t>
       </w:r>
     </w:p>
     <w:p>
       <w:r>
         <w:drawing>
-          <wp:inline distT="0" distB="0" distL="0" distR="0" wp14:anchorId="674C8B22" wp14:editId="6160D17C">
-            <wp:extent cx="5731510" cy="1254760"/>
-            <wp:effectExtent l="0" t="0" r="2540" b="2540"/>
-            <wp:docPr id="8" name="Picture 8"/>
+          <wp:inline distT="0" distB="0" distL="0" distR="0" wp14:anchorId="55ACAA2D" wp14:editId="6DB46BF9">
+            <wp:extent cx="5731510" cy="1641475"/>
+            <wp:effectExtent l="0" t="0" r="2540" b="0"/>
+            <wp:docPr id="2" name="Picture 2"/>
             <wp:cNvGraphicFramePr>
               <a:graphicFrameLocks xmlns:a="http://schemas.openxmlformats.org/drawingml/2006/main" noChangeAspect="1"/>
             </wp:cNvGraphicFramePr>
@@ -488,6 +476,255 @@
                   <pic:spPr>
                     <a:xfrm>
                       <a:off x="0" y="0"/>
+                      <a:ext cx="5731510" cy="1641475"/>
+                    </a:xfrm>
+                    <a:prstGeom prst="rect">
+                      <a:avLst/>
+                    </a:prstGeom>
+                  </pic:spPr>
+                </pic:pic>
+              </a:graphicData>
+            </a:graphic>
+          </wp:inline>
+        </w:drawing>
+      </w:r>
+    </w:p>
+    <w:p>
+      <w:r>
+        <w:t>Testing:</w:t>
+      </w:r>
+    </w:p>
+    <w:p>
+      <w:r>
+        <w:t xml:space="preserve"> </w:t>
+      </w:r>
+      <w:r>
+        <w:drawing>
+          <wp:inline distT="0" distB="0" distL="0" distR="0" wp14:anchorId="59058075" wp14:editId="431DF274">
+            <wp:extent cx="3362794" cy="1657581"/>
+            <wp:effectExtent l="0" t="0" r="9525" b="0"/>
+            <wp:docPr id="4" name="Picture 4"/>
+            <wp:cNvGraphicFramePr>
+              <a:graphicFrameLocks xmlns:a="http://schemas.openxmlformats.org/drawingml/2006/main" noChangeAspect="1"/>
+            </wp:cNvGraphicFramePr>
+            <a:graphic xmlns:a="http://schemas.openxmlformats.org/drawingml/2006/main">
+              <a:graphicData uri="http://schemas.openxmlformats.org/drawingml/2006/picture">
+                <pic:pic xmlns:pic="http://schemas.openxmlformats.org/drawingml/2006/picture">
+                  <pic:nvPicPr>
+                    <pic:cNvPr id="1" name=""/>
+                    <pic:cNvPicPr/>
+                  </pic:nvPicPr>
+                  <pic:blipFill>
+                    <a:blip r:embed="rId11"/>
+                    <a:stretch>
+                      <a:fillRect/>
+                    </a:stretch>
+                  </pic:blipFill>
+                  <pic:spPr>
+                    <a:xfrm>
+                      <a:off x="0" y="0"/>
+                      <a:ext cx="3362794" cy="1657581"/>
+                    </a:xfrm>
+                    <a:prstGeom prst="rect">
+                      <a:avLst/>
+                    </a:prstGeom>
+                  </pic:spPr>
+                </pic:pic>
+              </a:graphicData>
+            </a:graphic>
+          </wp:inline>
+        </w:drawing>
+      </w:r>
+    </w:p>
+    <w:p>
+      <w:pPr>
+        <w:pStyle w:val="Heading3"/>
+      </w:pPr>
+      <w:proofErr w:type="spellStart"/>
+      <w:r>
+        <w:t>displayInterventionReport</w:t>
+      </w:r>
+      <w:proofErr w:type="spellEnd"/>
+      <w:r>
+        <w:t>(learnerList)</w:t>
+      </w:r>
+    </w:p>
+    <w:p>
+      <w:r>
+        <w:t>Function to generate a List of learners needing intervention and reason why</w:t>
+      </w:r>
+    </w:p>
+    <w:p>
+      <w:r>
+        <w:drawing>
+          <wp:inline distT="0" distB="0" distL="0" distR="0" wp14:anchorId="36CDE80F" wp14:editId="05510232">
+            <wp:extent cx="5731510" cy="2540000"/>
+            <wp:effectExtent l="0" t="0" r="2540" b="0"/>
+            <wp:docPr id="10" name="Picture 10"/>
+            <wp:cNvGraphicFramePr>
+              <a:graphicFrameLocks xmlns:a="http://schemas.openxmlformats.org/drawingml/2006/main" noChangeAspect="1"/>
+            </wp:cNvGraphicFramePr>
+            <a:graphic xmlns:a="http://schemas.openxmlformats.org/drawingml/2006/main">
+              <a:graphicData uri="http://schemas.openxmlformats.org/drawingml/2006/picture">
+                <pic:pic xmlns:pic="http://schemas.openxmlformats.org/drawingml/2006/picture">
+                  <pic:nvPicPr>
+                    <pic:cNvPr id="1" name=""/>
+                    <pic:cNvPicPr/>
+                  </pic:nvPicPr>
+                  <pic:blipFill>
+                    <a:blip r:embed="rId12"/>
+                    <a:stretch>
+                      <a:fillRect/>
+                    </a:stretch>
+                  </pic:blipFill>
+                  <pic:spPr>
+                    <a:xfrm>
+                      <a:off x="0" y="0"/>
+                      <a:ext cx="5731510" cy="2540000"/>
+                    </a:xfrm>
+                    <a:prstGeom prst="rect">
+                      <a:avLst/>
+                    </a:prstGeom>
+                  </pic:spPr>
+                </pic:pic>
+              </a:graphicData>
+            </a:graphic>
+          </wp:inline>
+        </w:drawing>
+      </w:r>
+    </w:p>
+    <w:p>
+      <w:r>
+        <w:drawing>
+          <wp:inline distT="0" distB="0" distL="0" distR="0" wp14:anchorId="42E163CD" wp14:editId="26B126DD">
+            <wp:extent cx="5731510" cy="2825750"/>
+            <wp:effectExtent l="0" t="0" r="2540" b="0"/>
+            <wp:docPr id="11" name="Picture 11"/>
+            <wp:cNvGraphicFramePr>
+              <a:graphicFrameLocks xmlns:a="http://schemas.openxmlformats.org/drawingml/2006/main" noChangeAspect="1"/>
+            </wp:cNvGraphicFramePr>
+            <a:graphic xmlns:a="http://schemas.openxmlformats.org/drawingml/2006/main">
+              <a:graphicData uri="http://schemas.openxmlformats.org/drawingml/2006/picture">
+                <pic:pic xmlns:pic="http://schemas.openxmlformats.org/drawingml/2006/picture">
+                  <pic:nvPicPr>
+                    <pic:cNvPr id="1" name=""/>
+                    <pic:cNvPicPr/>
+                  </pic:nvPicPr>
+                  <pic:blipFill>
+                    <a:blip r:embed="rId13"/>
+                    <a:stretch>
+                      <a:fillRect/>
+                    </a:stretch>
+                  </pic:blipFill>
+                  <pic:spPr>
+                    <a:xfrm>
+                      <a:off x="0" y="0"/>
+                      <a:ext cx="5731510" cy="2825750"/>
+                    </a:xfrm>
+                    <a:prstGeom prst="rect">
+                      <a:avLst/>
+                    </a:prstGeom>
+                  </pic:spPr>
+                </pic:pic>
+              </a:graphicData>
+            </a:graphic>
+          </wp:inline>
+        </w:drawing>
+      </w:r>
+    </w:p>
+    <w:p>
+      <w:r>
+        <w:t>Testing:</w:t>
+      </w:r>
+      <w:r>
+        <w:br/>
+      </w:r>
+      <w:r>
+        <w:drawing>
+          <wp:inline distT="0" distB="0" distL="0" distR="0" wp14:anchorId="7D643D3A" wp14:editId="098DD2A2">
+            <wp:extent cx="3210373" cy="2572109"/>
+            <wp:effectExtent l="0" t="0" r="9525" b="0"/>
+            <wp:docPr id="12" name="Picture 12"/>
+            <wp:cNvGraphicFramePr>
+              <a:graphicFrameLocks xmlns:a="http://schemas.openxmlformats.org/drawingml/2006/main" noChangeAspect="1"/>
+            </wp:cNvGraphicFramePr>
+            <a:graphic xmlns:a="http://schemas.openxmlformats.org/drawingml/2006/main">
+              <a:graphicData uri="http://schemas.openxmlformats.org/drawingml/2006/picture">
+                <pic:pic xmlns:pic="http://schemas.openxmlformats.org/drawingml/2006/picture">
+                  <pic:nvPicPr>
+                    <pic:cNvPr id="1" name=""/>
+                    <pic:cNvPicPr/>
+                  </pic:nvPicPr>
+                  <pic:blipFill>
+                    <a:blip r:embed="rId14"/>
+                    <a:stretch>
+                      <a:fillRect/>
+                    </a:stretch>
+                  </pic:blipFill>
+                  <pic:spPr>
+                    <a:xfrm>
+                      <a:off x="0" y="0"/>
+                      <a:ext cx="3210373" cy="2572109"/>
+                    </a:xfrm>
+                    <a:prstGeom prst="rect">
+                      <a:avLst/>
+                    </a:prstGeom>
+                  </pic:spPr>
+                </pic:pic>
+              </a:graphicData>
+            </a:graphic>
+          </wp:inline>
+        </w:drawing>
+      </w:r>
+    </w:p>
+    <w:p>
+      <w:pPr>
+        <w:pStyle w:val="Heading3"/>
+      </w:pPr>
+      <w:proofErr w:type="gramStart"/>
+      <w:r>
+        <w:t>calculateAverage(</w:t>
+      </w:r>
+      <w:proofErr w:type="gramEnd"/>
+      <w:r>
+        <w:t>total, count)</w:t>
+      </w:r>
+    </w:p>
+    <w:p>
+      <w:r>
+        <w:t>calculates average totals and returns as string and a single decimal point</w:t>
+      </w:r>
+    </w:p>
+    <w:p>
+      <w:r>
+        <w:rPr>
+          <w:noProof/>
+          <w:lang w:val="en-US"/>
+        </w:rPr>
+        <w:drawing>
+          <wp:inline distT="0" distB="0" distL="0" distR="0" wp14:anchorId="674C8B22" wp14:editId="6160D17C">
+            <wp:extent cx="5731510" cy="1254760"/>
+            <wp:effectExtent l="0" t="0" r="2540" b="2540"/>
+            <wp:docPr id="8" name="Picture 8"/>
+            <wp:cNvGraphicFramePr>
+              <a:graphicFrameLocks xmlns:a="http://schemas.openxmlformats.org/drawingml/2006/main" noChangeAspect="1"/>
+            </wp:cNvGraphicFramePr>
+            <a:graphic xmlns:a="http://schemas.openxmlformats.org/drawingml/2006/main">
+              <a:graphicData uri="http://schemas.openxmlformats.org/drawingml/2006/picture">
+                <pic:pic xmlns:pic="http://schemas.openxmlformats.org/drawingml/2006/picture">
+                  <pic:nvPicPr>
+                    <pic:cNvPr id="1" name=""/>
+                    <pic:cNvPicPr/>
+                  </pic:nvPicPr>
+                  <pic:blipFill>
+                    <a:blip r:embed="rId15"/>
+                    <a:stretch>
+                      <a:fillRect/>
+                    </a:stretch>
+                  </pic:blipFill>
+                  <pic:spPr>
+                    <a:xfrm>
+                      <a:off x="0" y="0"/>
                       <a:ext cx="5731510" cy="1254760"/>
                     </a:xfrm>
                     <a:prstGeom prst="rect">
@@ -501,8 +738,115 @@
         </w:drawing>
       </w:r>
     </w:p>
-    <w:p/>
-    <w:p/>
+    <w:p>
+      <w:pPr>
+        <w:pStyle w:val="Heading3"/>
+      </w:pPr>
+      <w:proofErr w:type="spellStart"/>
+      <w:proofErr w:type="gramStart"/>
+      <w:r>
+        <w:t>runTests</w:t>
+      </w:r>
+      <w:proofErr w:type="spellEnd"/>
+      <w:r>
+        <w:t>(</w:t>
+      </w:r>
+      <w:proofErr w:type="gramEnd"/>
+      <w:r>
+        <w:t>)</w:t>
+      </w:r>
+    </w:p>
+    <w:p>
+      <w:r>
+        <w:t xml:space="preserve">Function to create some test data to </w:t>
+      </w:r>
+      <w:r>
+        <w:t>check if expected results would show correctly</w:t>
+      </w:r>
+    </w:p>
+    <w:p>
+      <w:r>
+        <w:drawing>
+          <wp:inline distT="0" distB="0" distL="0" distR="0" wp14:anchorId="6FC4E2C6" wp14:editId="0E109CC6">
+            <wp:extent cx="5731510" cy="2449195"/>
+            <wp:effectExtent l="0" t="0" r="2540" b="8255"/>
+            <wp:docPr id="13" name="Picture 13"/>
+            <wp:cNvGraphicFramePr>
+              <a:graphicFrameLocks xmlns:a="http://schemas.openxmlformats.org/drawingml/2006/main" noChangeAspect="1"/>
+            </wp:cNvGraphicFramePr>
+            <a:graphic xmlns:a="http://schemas.openxmlformats.org/drawingml/2006/main">
+              <a:graphicData uri="http://schemas.openxmlformats.org/drawingml/2006/picture">
+                <pic:pic xmlns:pic="http://schemas.openxmlformats.org/drawingml/2006/picture">
+                  <pic:nvPicPr>
+                    <pic:cNvPr id="1" name=""/>
+                    <pic:cNvPicPr/>
+                  </pic:nvPicPr>
+                  <pic:blipFill>
+                    <a:blip r:embed="rId16"/>
+                    <a:stretch>
+                      <a:fillRect/>
+                    </a:stretch>
+                  </pic:blipFill>
+                  <pic:spPr>
+                    <a:xfrm>
+                      <a:off x="0" y="0"/>
+                      <a:ext cx="5731510" cy="2449195"/>
+                    </a:xfrm>
+                    <a:prstGeom prst="rect">
+                      <a:avLst/>
+                    </a:prstGeom>
+                  </pic:spPr>
+                </pic:pic>
+              </a:graphicData>
+            </a:graphic>
+          </wp:inline>
+        </w:drawing>
+      </w:r>
+    </w:p>
+    <w:p>
+      <w:r>
+        <w:t>Testing:</w:t>
+      </w:r>
+    </w:p>
+    <w:p>
+      <w:r>
+        <w:drawing>
+          <wp:inline distT="0" distB="0" distL="0" distR="0" wp14:anchorId="6401BFD8" wp14:editId="3229A6B3">
+            <wp:extent cx="5134692" cy="1905266"/>
+            <wp:effectExtent l="0" t="0" r="8890" b="0"/>
+            <wp:docPr id="14" name="Picture 14"/>
+            <wp:cNvGraphicFramePr>
+              <a:graphicFrameLocks xmlns:a="http://schemas.openxmlformats.org/drawingml/2006/main" noChangeAspect="1"/>
+            </wp:cNvGraphicFramePr>
+            <a:graphic xmlns:a="http://schemas.openxmlformats.org/drawingml/2006/main">
+              <a:graphicData uri="http://schemas.openxmlformats.org/drawingml/2006/picture">
+                <pic:pic xmlns:pic="http://schemas.openxmlformats.org/drawingml/2006/picture">
+                  <pic:nvPicPr>
+                    <pic:cNvPr id="1" name=""/>
+                    <pic:cNvPicPr/>
+                  </pic:nvPicPr>
+                  <pic:blipFill>
+                    <a:blip r:embed="rId17"/>
+                    <a:stretch>
+                      <a:fillRect/>
+                    </a:stretch>
+                  </pic:blipFill>
+                  <pic:spPr>
+                    <a:xfrm>
+                      <a:off x="0" y="0"/>
+                      <a:ext cx="5134692" cy="1905266"/>
+                    </a:xfrm>
+                    <a:prstGeom prst="rect">
+                      <a:avLst/>
+                    </a:prstGeom>
+                  </pic:spPr>
+                </pic:pic>
+              </a:graphicData>
+            </a:graphic>
+          </wp:inline>
+        </w:drawing>
+      </w:r>
+    </w:p>
     <w:sectPr>
       <w:pgSz w:w="11906" w:h="16838"/>
       <w:pgMar w:top="1440" w:right="1440" w:bottom="1440" w:left="1440" w:header="708" w:footer="708" w:gutter="0"/>

</xml_diff>

<commit_message>
Pushing output and finished off testing docx
</commit_message>
<xml_diff>
--- a/PM-02/learner-performance-tracker/evidence/testing.docx
+++ b/PM-02/learner-performance-tracker/evidence/testing.docx
@@ -10,12 +10,97 @@
         <w:t>HTML Code Snippets:</w:t>
       </w:r>
     </w:p>
-    <w:p/>
+    <w:p>
+      <w:r>
+        <w:drawing>
+          <wp:inline distT="0" distB="0" distL="0" distR="0" wp14:anchorId="0958B5B9" wp14:editId="79D74496">
+            <wp:extent cx="5731510" cy="3120390"/>
+            <wp:effectExtent l="0" t="0" r="2540" b="3810"/>
+            <wp:docPr id="15" name="Picture 15"/>
+            <wp:cNvGraphicFramePr>
+              <a:graphicFrameLocks xmlns:a="http://schemas.openxmlformats.org/drawingml/2006/main" noChangeAspect="1"/>
+            </wp:cNvGraphicFramePr>
+            <a:graphic xmlns:a="http://schemas.openxmlformats.org/drawingml/2006/main">
+              <a:graphicData uri="http://schemas.openxmlformats.org/drawingml/2006/picture">
+                <pic:pic xmlns:pic="http://schemas.openxmlformats.org/drawingml/2006/picture">
+                  <pic:nvPicPr>
+                    <pic:cNvPr id="1" name=""/>
+                    <pic:cNvPicPr/>
+                  </pic:nvPicPr>
+                  <pic:blipFill>
+                    <a:blip r:embed="rId4"/>
+                    <a:stretch>
+                      <a:fillRect/>
+                    </a:stretch>
+                  </pic:blipFill>
+                  <pic:spPr>
+                    <a:xfrm>
+                      <a:off x="0" y="0"/>
+                      <a:ext cx="5731510" cy="3120390"/>
+                    </a:xfrm>
+                    <a:prstGeom prst="rect">
+                      <a:avLst/>
+                    </a:prstGeom>
+                  </pic:spPr>
+                </pic:pic>
+              </a:graphicData>
+            </a:graphic>
+          </wp:inline>
+        </w:drawing>
+      </w:r>
+    </w:p>
+    <w:p>
+      <w:r>
+        <w:t>Testing:</w:t>
+      </w:r>
+    </w:p>
+    <w:p>
+      <w:bookmarkStart w:id="0" w:name="_GoBack"/>
+      <w:r>
+        <w:drawing>
+          <wp:inline distT="0" distB="0" distL="0" distR="0" wp14:anchorId="0A231682" wp14:editId="745B917E">
+            <wp:extent cx="5731510" cy="2718435"/>
+            <wp:effectExtent l="0" t="0" r="2540" b="5715"/>
+            <wp:docPr id="16" name="Picture 16"/>
+            <wp:cNvGraphicFramePr>
+              <a:graphicFrameLocks xmlns:a="http://schemas.openxmlformats.org/drawingml/2006/main" noChangeAspect="1"/>
+            </wp:cNvGraphicFramePr>
+            <a:graphic xmlns:a="http://schemas.openxmlformats.org/drawingml/2006/main">
+              <a:graphicData uri="http://schemas.openxmlformats.org/drawingml/2006/picture">
+                <pic:pic xmlns:pic="http://schemas.openxmlformats.org/drawingml/2006/picture">
+                  <pic:nvPicPr>
+                    <pic:cNvPr id="1" name=""/>
+                    <pic:cNvPicPr/>
+                  </pic:nvPicPr>
+                  <pic:blipFill>
+                    <a:blip r:embed="rId5"/>
+                    <a:stretch>
+                      <a:fillRect/>
+                    </a:stretch>
+                  </pic:blipFill>
+                  <pic:spPr>
+                    <a:xfrm>
+                      <a:off x="0" y="0"/>
+                      <a:ext cx="5731510" cy="2718435"/>
+                    </a:xfrm>
+                    <a:prstGeom prst="rect">
+                      <a:avLst/>
+                    </a:prstGeom>
+                  </pic:spPr>
+                </pic:pic>
+              </a:graphicData>
+            </a:graphic>
+          </wp:inline>
+        </w:drawing>
+      </w:r>
+      <w:bookmarkEnd w:id="0"/>
+    </w:p>
     <w:p>
       <w:pPr>
         <w:pStyle w:val="Heading1"/>
       </w:pPr>
       <w:r>
+        <w:lastRenderedPageBreak/>
         <w:t>JavaScript Code Snippets:</w:t>
       </w:r>
     </w:p>
@@ -55,7 +140,7 @@
                     <pic:cNvPicPr/>
                   </pic:nvPicPr>
                   <pic:blipFill>
-                    <a:blip r:embed="rId4"/>
+                    <a:blip r:embed="rId6"/>
                     <a:stretch>
                       <a:fillRect/>
                     </a:stretch>
@@ -94,12 +179,7 @@
         <w:t>s</w:t>
       </w:r>
       <w:r>
-        <w:t xml:space="preserve"> – Display</w:t>
-      </w:r>
-      <w:bookmarkStart w:id="0" w:name="_GoBack"/>
-      <w:bookmarkEnd w:id="0"/>
-      <w:r>
-        <w:t xml:space="preserve"> Student Information and Validate Results</w:t>
+        <w:t xml:space="preserve"> – Display Student Information and Validate Results</w:t>
       </w:r>
       <w:r>
         <w:t>:</w:t>
@@ -148,7 +228,7 @@
                     <pic:cNvPicPr/>
                   </pic:nvPicPr>
                   <pic:blipFill>
-                    <a:blip r:embed="rId5"/>
+                    <a:blip r:embed="rId7"/>
                     <a:stretch>
                       <a:fillRect/>
                     </a:stretch>
@@ -214,7 +294,7 @@
                     <pic:cNvPicPr/>
                   </pic:nvPicPr>
                   <pic:blipFill>
-                    <a:blip r:embed="rId6"/>
+                    <a:blip r:embed="rId8"/>
                     <a:stretch>
                       <a:fillRect/>
                     </a:stretch>
@@ -266,6 +346,7 @@
           <w:noProof/>
           <w:lang w:val="en-US"/>
         </w:rPr>
+        <w:lastRenderedPageBreak/>
         <w:drawing>
           <wp:inline distT="0" distB="0" distL="0" distR="0" wp14:anchorId="319D6088" wp14:editId="725EF4C0">
             <wp:extent cx="5731510" cy="1846580"/>
@@ -282,7 +363,7 @@
                     <pic:cNvPicPr/>
                   </pic:nvPicPr>
                   <pic:blipFill>
-                    <a:blip r:embed="rId7"/>
+                    <a:blip r:embed="rId9"/>
                     <a:stretch>
                       <a:fillRect/>
                     </a:stretch>
@@ -357,7 +438,7 @@
                     <pic:cNvPicPr/>
                   </pic:nvPicPr>
                   <pic:blipFill>
-                    <a:blip r:embed="rId8"/>
+                    <a:blip r:embed="rId10"/>
                     <a:stretch>
                       <a:fillRect/>
                     </a:stretch>
@@ -383,6 +464,7 @@
         <w:pStyle w:val="Heading3"/>
       </w:pPr>
       <w:r>
+        <w:lastRenderedPageBreak/>
         <w:t>Test Evidence:</w:t>
       </w:r>
     </w:p>
@@ -408,7 +490,7 @@
                     <pic:cNvPicPr/>
                   </pic:nvPicPr>
                   <pic:blipFill>
-                    <a:blip r:embed="rId9"/>
+                    <a:blip r:embed="rId11"/>
                     <a:stretch>
                       <a:fillRect/>
                     </a:stretch>
@@ -452,115 +534,16 @@
     </w:p>
     <w:p>
       <w:r>
+        <w:rPr>
+          <w:noProof/>
+          <w:lang w:val="en-US"/>
+        </w:rPr>
+        <w:lastRenderedPageBreak/>
         <w:drawing>
           <wp:inline distT="0" distB="0" distL="0" distR="0" wp14:anchorId="55ACAA2D" wp14:editId="6DB46BF9">
             <wp:extent cx="5731510" cy="1641475"/>
             <wp:effectExtent l="0" t="0" r="2540" b="0"/>
             <wp:docPr id="2" name="Picture 2"/>
-            <wp:cNvGraphicFramePr>
-              <a:graphicFrameLocks xmlns:a="http://schemas.openxmlformats.org/drawingml/2006/main" noChangeAspect="1"/>
-            </wp:cNvGraphicFramePr>
-            <a:graphic xmlns:a="http://schemas.openxmlformats.org/drawingml/2006/main">
-              <a:graphicData uri="http://schemas.openxmlformats.org/drawingml/2006/picture">
-                <pic:pic xmlns:pic="http://schemas.openxmlformats.org/drawingml/2006/picture">
-                  <pic:nvPicPr>
-                    <pic:cNvPr id="1" name=""/>
-                    <pic:cNvPicPr/>
-                  </pic:nvPicPr>
-                  <pic:blipFill>
-                    <a:blip r:embed="rId10"/>
-                    <a:stretch>
-                      <a:fillRect/>
-                    </a:stretch>
-                  </pic:blipFill>
-                  <pic:spPr>
-                    <a:xfrm>
-                      <a:off x="0" y="0"/>
-                      <a:ext cx="5731510" cy="1641475"/>
-                    </a:xfrm>
-                    <a:prstGeom prst="rect">
-                      <a:avLst/>
-                    </a:prstGeom>
-                  </pic:spPr>
-                </pic:pic>
-              </a:graphicData>
-            </a:graphic>
-          </wp:inline>
-        </w:drawing>
-      </w:r>
-    </w:p>
-    <w:p>
-      <w:r>
-        <w:t>Testing:</w:t>
-      </w:r>
-    </w:p>
-    <w:p>
-      <w:r>
-        <w:t xml:space="preserve"> </w:t>
-      </w:r>
-      <w:r>
-        <w:drawing>
-          <wp:inline distT="0" distB="0" distL="0" distR="0" wp14:anchorId="59058075" wp14:editId="431DF274">
-            <wp:extent cx="3362794" cy="1657581"/>
-            <wp:effectExtent l="0" t="0" r="9525" b="0"/>
-            <wp:docPr id="4" name="Picture 4"/>
-            <wp:cNvGraphicFramePr>
-              <a:graphicFrameLocks xmlns:a="http://schemas.openxmlformats.org/drawingml/2006/main" noChangeAspect="1"/>
-            </wp:cNvGraphicFramePr>
-            <a:graphic xmlns:a="http://schemas.openxmlformats.org/drawingml/2006/main">
-              <a:graphicData uri="http://schemas.openxmlformats.org/drawingml/2006/picture">
-                <pic:pic xmlns:pic="http://schemas.openxmlformats.org/drawingml/2006/picture">
-                  <pic:nvPicPr>
-                    <pic:cNvPr id="1" name=""/>
-                    <pic:cNvPicPr/>
-                  </pic:nvPicPr>
-                  <pic:blipFill>
-                    <a:blip r:embed="rId11"/>
-                    <a:stretch>
-                      <a:fillRect/>
-                    </a:stretch>
-                  </pic:blipFill>
-                  <pic:spPr>
-                    <a:xfrm>
-                      <a:off x="0" y="0"/>
-                      <a:ext cx="3362794" cy="1657581"/>
-                    </a:xfrm>
-                    <a:prstGeom prst="rect">
-                      <a:avLst/>
-                    </a:prstGeom>
-                  </pic:spPr>
-                </pic:pic>
-              </a:graphicData>
-            </a:graphic>
-          </wp:inline>
-        </w:drawing>
-      </w:r>
-    </w:p>
-    <w:p>
-      <w:pPr>
-        <w:pStyle w:val="Heading3"/>
-      </w:pPr>
-      <w:proofErr w:type="spellStart"/>
-      <w:r>
-        <w:t>displayInterventionReport</w:t>
-      </w:r>
-      <w:proofErr w:type="spellEnd"/>
-      <w:r>
-        <w:t>(learnerList)</w:t>
-      </w:r>
-    </w:p>
-    <w:p>
-      <w:r>
-        <w:t>Function to generate a List of learners needing intervention and reason why</w:t>
-      </w:r>
-    </w:p>
-    <w:p>
-      <w:r>
-        <w:drawing>
-          <wp:inline distT="0" distB="0" distL="0" distR="0" wp14:anchorId="36CDE80F" wp14:editId="05510232">
-            <wp:extent cx="5731510" cy="2540000"/>
-            <wp:effectExtent l="0" t="0" r="2540" b="0"/>
-            <wp:docPr id="10" name="Picture 10"/>
             <wp:cNvGraphicFramePr>
               <a:graphicFrameLocks xmlns:a="http://schemas.openxmlformats.org/drawingml/2006/main" noChangeAspect="1"/>
             </wp:cNvGraphicFramePr>
@@ -580,7 +563,7 @@
                   <pic:spPr>
                     <a:xfrm>
                       <a:off x="0" y="0"/>
-                      <a:ext cx="5731510" cy="2540000"/>
+                      <a:ext cx="5731510" cy="1641475"/>
                     </a:xfrm>
                     <a:prstGeom prst="rect">
                       <a:avLst/>
@@ -595,11 +578,23 @@
     </w:p>
     <w:p>
       <w:r>
+        <w:t>Testing:</w:t>
+      </w:r>
+    </w:p>
+    <w:p>
+      <w:r>
+        <w:t xml:space="preserve"> </w:t>
+      </w:r>
+      <w:r>
+        <w:rPr>
+          <w:noProof/>
+          <w:lang w:val="en-US"/>
+        </w:rPr>
         <w:drawing>
-          <wp:inline distT="0" distB="0" distL="0" distR="0" wp14:anchorId="42E163CD" wp14:editId="26B126DD">
-            <wp:extent cx="5731510" cy="2825750"/>
-            <wp:effectExtent l="0" t="0" r="2540" b="0"/>
-            <wp:docPr id="11" name="Picture 11"/>
+          <wp:inline distT="0" distB="0" distL="0" distR="0" wp14:anchorId="59058075" wp14:editId="431DF274">
+            <wp:extent cx="3362794" cy="1657581"/>
+            <wp:effectExtent l="0" t="0" r="9525" b="0"/>
+            <wp:docPr id="4" name="Picture 4"/>
             <wp:cNvGraphicFramePr>
               <a:graphicFrameLocks xmlns:a="http://schemas.openxmlformats.org/drawingml/2006/main" noChangeAspect="1"/>
             </wp:cNvGraphicFramePr>
@@ -619,6 +614,111 @@
                   <pic:spPr>
                     <a:xfrm>
                       <a:off x="0" y="0"/>
+                      <a:ext cx="3362794" cy="1657581"/>
+                    </a:xfrm>
+                    <a:prstGeom prst="rect">
+                      <a:avLst/>
+                    </a:prstGeom>
+                  </pic:spPr>
+                </pic:pic>
+              </a:graphicData>
+            </a:graphic>
+          </wp:inline>
+        </w:drawing>
+      </w:r>
+    </w:p>
+    <w:p>
+      <w:pPr>
+        <w:pStyle w:val="Heading3"/>
+      </w:pPr>
+      <w:proofErr w:type="spellStart"/>
+      <w:r>
+        <w:t>displayInterventionReport</w:t>
+      </w:r>
+      <w:proofErr w:type="spellEnd"/>
+      <w:r>
+        <w:t>(learnerList)</w:t>
+      </w:r>
+    </w:p>
+    <w:p>
+      <w:r>
+        <w:t>Function to generate a List of learners needing intervention and reason why</w:t>
+      </w:r>
+    </w:p>
+    <w:p>
+      <w:r>
+        <w:rPr>
+          <w:noProof/>
+          <w:lang w:val="en-US"/>
+        </w:rPr>
+        <w:drawing>
+          <wp:inline distT="0" distB="0" distL="0" distR="0" wp14:anchorId="36CDE80F" wp14:editId="05510232">
+            <wp:extent cx="5731510" cy="2540000"/>
+            <wp:effectExtent l="0" t="0" r="2540" b="0"/>
+            <wp:docPr id="10" name="Picture 10"/>
+            <wp:cNvGraphicFramePr>
+              <a:graphicFrameLocks xmlns:a="http://schemas.openxmlformats.org/drawingml/2006/main" noChangeAspect="1"/>
+            </wp:cNvGraphicFramePr>
+            <a:graphic xmlns:a="http://schemas.openxmlformats.org/drawingml/2006/main">
+              <a:graphicData uri="http://schemas.openxmlformats.org/drawingml/2006/picture">
+                <pic:pic xmlns:pic="http://schemas.openxmlformats.org/drawingml/2006/picture">
+                  <pic:nvPicPr>
+                    <pic:cNvPr id="1" name=""/>
+                    <pic:cNvPicPr/>
+                  </pic:nvPicPr>
+                  <pic:blipFill>
+                    <a:blip r:embed="rId14"/>
+                    <a:stretch>
+                      <a:fillRect/>
+                    </a:stretch>
+                  </pic:blipFill>
+                  <pic:spPr>
+                    <a:xfrm>
+                      <a:off x="0" y="0"/>
+                      <a:ext cx="5731510" cy="2540000"/>
+                    </a:xfrm>
+                    <a:prstGeom prst="rect">
+                      <a:avLst/>
+                    </a:prstGeom>
+                  </pic:spPr>
+                </pic:pic>
+              </a:graphicData>
+            </a:graphic>
+          </wp:inline>
+        </w:drawing>
+      </w:r>
+    </w:p>
+    <w:p>
+      <w:r>
+        <w:rPr>
+          <w:noProof/>
+          <w:lang w:val="en-US"/>
+        </w:rPr>
+        <w:lastRenderedPageBreak/>
+        <w:drawing>
+          <wp:inline distT="0" distB="0" distL="0" distR="0" wp14:anchorId="42E163CD" wp14:editId="26B126DD">
+            <wp:extent cx="5731510" cy="2825750"/>
+            <wp:effectExtent l="0" t="0" r="2540" b="0"/>
+            <wp:docPr id="11" name="Picture 11"/>
+            <wp:cNvGraphicFramePr>
+              <a:graphicFrameLocks xmlns:a="http://schemas.openxmlformats.org/drawingml/2006/main" noChangeAspect="1"/>
+            </wp:cNvGraphicFramePr>
+            <a:graphic xmlns:a="http://schemas.openxmlformats.org/drawingml/2006/main">
+              <a:graphicData uri="http://schemas.openxmlformats.org/drawingml/2006/picture">
+                <pic:pic xmlns:pic="http://schemas.openxmlformats.org/drawingml/2006/picture">
+                  <pic:nvPicPr>
+                    <pic:cNvPr id="1" name=""/>
+                    <pic:cNvPicPr/>
+                  </pic:nvPicPr>
+                  <pic:blipFill>
+                    <a:blip r:embed="rId15"/>
+                    <a:stretch>
+                      <a:fillRect/>
+                    </a:stretch>
+                  </pic:blipFill>
+                  <pic:spPr>
+                    <a:xfrm>
+                      <a:off x="0" y="0"/>
                       <a:ext cx="5731510" cy="2825750"/>
                     </a:xfrm>
                     <a:prstGeom prst="rect">
@@ -640,6 +740,10 @@
         <w:br/>
       </w:r>
       <w:r>
+        <w:rPr>
+          <w:noProof/>
+          <w:lang w:val="en-US"/>
+        </w:rPr>
         <w:drawing>
           <wp:inline distT="0" distB="0" distL="0" distR="0" wp14:anchorId="7D643D3A" wp14:editId="098DD2A2">
             <wp:extent cx="3210373" cy="2572109"/>
@@ -656,7 +760,7 @@
                     <pic:cNvPicPr/>
                   </pic:nvPicPr>
                   <pic:blipFill>
-                    <a:blip r:embed="rId14"/>
+                    <a:blip r:embed="rId16"/>
                     <a:stretch>
                       <a:fillRect/>
                     </a:stretch>
@@ -717,7 +821,7 @@
                     <pic:cNvPicPr/>
                   </pic:nvPicPr>
                   <pic:blipFill>
-                    <a:blip r:embed="rId15"/>
+                    <a:blip r:embed="rId17"/>
                     <a:stretch>
                       <a:fillRect/>
                     </a:stretch>
@@ -766,6 +870,11 @@
     </w:p>
     <w:p>
       <w:r>
+        <w:rPr>
+          <w:noProof/>
+          <w:lang w:val="en-US"/>
+        </w:rPr>
+        <w:lastRenderedPageBreak/>
         <w:drawing>
           <wp:inline distT="0" distB="0" distL="0" distR="0" wp14:anchorId="6FC4E2C6" wp14:editId="0E109CC6">
             <wp:extent cx="5731510" cy="2449195"/>
@@ -782,7 +891,7 @@
                     <pic:cNvPicPr/>
                   </pic:nvPicPr>
                   <pic:blipFill>
-                    <a:blip r:embed="rId16"/>
+                    <a:blip r:embed="rId18"/>
                     <a:stretch>
                       <a:fillRect/>
                     </a:stretch>
@@ -810,6 +919,10 @@
     </w:p>
     <w:p>
       <w:r>
+        <w:rPr>
+          <w:noProof/>
+          <w:lang w:val="en-US"/>
+        </w:rPr>
         <w:drawing>
           <wp:inline distT="0" distB="0" distL="0" distR="0" wp14:anchorId="6401BFD8" wp14:editId="3229A6B3">
             <wp:extent cx="5134692" cy="1905266"/>
@@ -826,7 +939,7 @@
                     <pic:cNvPicPr/>
                   </pic:nvPicPr>
                   <pic:blipFill>
-                    <a:blip r:embed="rId17"/>
+                    <a:blip r:embed="rId19"/>
                     <a:stretch>
                       <a:fillRect/>
                     </a:stretch>

</xml_diff>